<commit_message>
RE implemntation Done / Stored as Stash Commit before final version comes
</commit_message>
<xml_diff>
--- a/datasheet_gen/word_templates/RE.docx
+++ b/datasheet_gen/word_templates/RE.docx
@@ -1218,80 +1218,6 @@
       </w:r>
     </w:p>
     <w:p>
-      <w:pPr>
-        <w:pStyle w:val="Caption"/>
-        <w:jc w:val="center"/>
-        <w:rPr>
-          <w:rFonts w:ascii="Arial" w:hAnsi="Arial" w:cs="Arial"/>
-          <w:b/>
-          <w:bCs/>
-          <w:i w:val="0"/>
-          <w:iCs w:val="0"/>
-          <w:color w:val="auto"/>
-          <w:sz w:val="20"/>
-          <w:szCs w:val="20"/>
-        </w:rPr>
-      </w:pPr>
-      <w:r>
-        <w:rPr>
-          <w:rFonts w:ascii="Arial" w:hAnsi="Arial"/>
-          <w:b/>
-          <w:i w:val="0"/>
-          <w:noProof/>
-          <w:color w:val="000000"/>
-          <w:sz w:val="20"/>
-        </w:rPr>
-        <w:drawing>
-          <wp:inline distT="0" distB="0" distL="0" distR="0" wp14:anchorId="23CCFAEC" wp14:editId="41DB8378">
-            <wp:extent cx="5760000" cy="3240000"/>
-            <wp:effectExtent l="0" t="0" r="0" b="0"/>
-            <wp:docPr id="1540005114" name="Picture 4"/>
-            <wp:cNvGraphicFramePr>
-              <a:graphicFrameLocks xmlns:a="http://schemas.openxmlformats.org/drawingml/2006/main"/>
-            </wp:cNvGraphicFramePr>
-            <a:graphic xmlns:a="http://schemas.openxmlformats.org/drawingml/2006/main">
-              <a:graphicData uri="http://schemas.openxmlformats.org/drawingml/2006/picture">
-                <pic:pic xmlns:pic="http://schemas.openxmlformats.org/drawingml/2006/picture">
-                  <pic:nvPicPr>
-                    <pic:cNvPr id="0" name="Picture 3"/>
-                    <pic:cNvPicPr>
-                      <a:picLocks noChangeAspect="1" noChangeArrowheads="1"/>
-                    </pic:cNvPicPr>
-                  </pic:nvPicPr>
-                  <pic:blipFill>
-                    <a:blip r:embed="rId12" cstate="print">
-                      <a:extLst>
-                        <a:ext uri="{28A0092B-C50C-407E-A947-70E740481C1C}">
-                          <a14:useLocalDpi xmlns:a14="http://schemas.microsoft.com/office/drawing/2010/main" val="0"/>
-                        </a:ext>
-                      </a:extLst>
-                    </a:blip>
-                    <a:srcRect/>
-                    <a:stretch>
-                      <a:fillRect/>
-                    </a:stretch>
-                  </pic:blipFill>
-                  <pic:spPr bwMode="auto">
-                    <a:xfrm>
-                      <a:off x="0" y="0"/>
-                      <a:ext cx="5760000" cy="3240000"/>
-                    </a:xfrm>
-                    <a:prstGeom prst="rect">
-                      <a:avLst/>
-                    </a:prstGeom>
-                    <a:noFill/>
-                    <a:ln>
-                      <a:noFill/>
-                    </a:ln>
-                  </pic:spPr>
-                </pic:pic>
-              </a:graphicData>
-            </a:graphic>
-          </wp:inline>
-        </w:drawing>
-      </w:r>
-    </w:p>
-    <w:p>
       <w:r>
         <w:t>{{ img_figure_2 }}</w:t>
       </w:r>
@@ -1775,7 +1701,7 @@
           <w:p>
             <w:r/>
             <w:r>
-              <w:t>{{ frequency_range_col_1 }}</w:t>
+              <w:t>{{r frequency_range_col_1 }}</w:t>
             </w:r>
           </w:p>
         </w:tc>
@@ -1794,7 +1720,7 @@
           <w:p>
             <w:r/>
             <w:r>
-              <w:t>{{ frequency_range_col_2 }}</w:t>
+              <w:t>{{r frequency_range_col_2 }}</w:t>
             </w:r>
           </w:p>
         </w:tc>
@@ -2075,12 +2001,7 @@
             </w:tcBorders>
             <w:vAlign w:val="center"/>
           </w:tcPr>
-          <w:p>
-            <w:r/>
-            <w:r>
-              <w:t>{{ turn_table_rotation_step_col_1 }}</w:t>
-            </w:r>
-          </w:p>
+          <w:p/>
         </w:tc>
         <w:tc>
           <w:tcPr>
@@ -4134,82 +4055,6 @@
       </w:r>
     </w:p>
     <w:p>
-      <w:pPr>
-        <w:pStyle w:val="Caption"/>
-        <w:jc w:val="center"/>
-        <w:rPr>
-          <w:rFonts w:ascii="Arial" w:hAnsi="Arial" w:cs="Arial"/>
-          <w:b/>
-          <w:bCs/>
-          <w:i w:val="0"/>
-          <w:iCs w:val="0"/>
-          <w:color w:val="auto"/>
-          <w:sz w:val="20"/>
-          <w:szCs w:val="20"/>
-        </w:rPr>
-      </w:pPr>
-      <w:r>
-        <w:rPr>
-          <w:rFonts w:ascii="Arial" w:hAnsi="Arial"/>
-          <w:b/>
-          <w:i w:val="0"/>
-          <w:noProof/>
-          <w:color w:val="000000"/>
-          <w:sz w:val="20"/>
-        </w:rPr>
-        <w:drawing>
-          <wp:inline distT="0" distB="0" distL="0" distR="0" wp14:anchorId="1524313E" wp14:editId="4A0D6FC7">
-            <wp:extent cx="5760000" cy="3240000"/>
-            <wp:effectExtent l="19050" t="19050" r="12700" b="17780"/>
-            <wp:docPr id="247956080" name="Picture 6"/>
-            <wp:cNvGraphicFramePr>
-              <a:graphicFrameLocks xmlns:a="http://schemas.openxmlformats.org/drawingml/2006/main"/>
-            </wp:cNvGraphicFramePr>
-            <a:graphic xmlns:a="http://schemas.openxmlformats.org/drawingml/2006/main">
-              <a:graphicData uri="http://schemas.openxmlformats.org/drawingml/2006/picture">
-                <pic:pic xmlns:pic="http://schemas.openxmlformats.org/drawingml/2006/picture">
-                  <pic:nvPicPr>
-                    <pic:cNvPr id="0" name="Picture 7"/>
-                    <pic:cNvPicPr>
-                      <a:picLocks noChangeAspect="1" noChangeArrowheads="1"/>
-                    </pic:cNvPicPr>
-                  </pic:nvPicPr>
-                  <pic:blipFill>
-                    <a:blip r:embed="rId14" cstate="print">
-                      <a:extLst>
-                        <a:ext uri="{28A0092B-C50C-407E-A947-70E740481C1C}">
-                          <a14:useLocalDpi xmlns:a14="http://schemas.microsoft.com/office/drawing/2010/main" val="0"/>
-                        </a:ext>
-                      </a:extLst>
-                    </a:blip>
-                    <a:srcRect/>
-                    <a:stretch>
-                      <a:fillRect/>
-                    </a:stretch>
-                  </pic:blipFill>
-                  <pic:spPr bwMode="auto">
-                    <a:xfrm>
-                      <a:off x="0" y="0"/>
-                      <a:ext cx="5760000" cy="3240000"/>
-                    </a:xfrm>
-                    <a:prstGeom prst="rect">
-                      <a:avLst/>
-                    </a:prstGeom>
-                    <a:noFill/>
-                    <a:ln w="3175">
-                      <a:solidFill>
-                        <a:schemeClr val="tx1"/>
-                      </a:solidFill>
-                    </a:ln>
-                  </pic:spPr>
-                </pic:pic>
-              </a:graphicData>
-            </a:graphic>
-          </wp:inline>
-        </w:drawing>
-      </w:r>
-    </w:p>
-    <w:p>
       <w:r>
         <w:t>{{ rec.img_horizontal }}</w:t>
       </w:r>
@@ -4818,87 +4663,6 @@
       </w:pPr>
     </w:p>
     <w:p>
-      <w:pPr>
-        <w:pStyle w:val="Caption"/>
-        <w:spacing w:after="0"/>
-        <w:jc w:val="center"/>
-        <w:rPr>
-          <w:rStyle w:val="Hyperlink"/>
-          <w:rFonts w:ascii="Arial" w:hAnsi="Arial" w:cs="Arial"/>
-          <w:b/>
-          <w:bCs/>
-          <w:i w:val="0"/>
-          <w:iCs w:val="0"/>
-          <w:noProof/>
-          <w:color w:val="auto"/>
-          <w:sz w:val="20"/>
-          <w:szCs w:val="20"/>
-          <w:u w:val="none"/>
-        </w:rPr>
-      </w:pPr>
-      <w:bookmarkStart w:id="173" w:name="_Toc225977173"/>
-      <w:r>
-        <w:rPr>
-          <w:rFonts w:ascii="Arial" w:hAnsi="Arial"/>
-          <w:b/>
-          <w:i w:val="0"/>
-          <w:noProof/>
-          <w:color w:val="000000"/>
-          <w:sz w:val="20"/>
-        </w:rPr>
-        <w:drawing>
-          <wp:inline distT="0" distB="0" distL="0" distR="0" wp14:anchorId="41643B55" wp14:editId="13A19E06">
-            <wp:extent cx="5040000" cy="3240000"/>
-            <wp:effectExtent l="19050" t="19050" r="27305" b="17780"/>
-            <wp:docPr id="602382992" name="Picture 9"/>
-            <wp:cNvGraphicFramePr>
-              <a:graphicFrameLocks xmlns:a="http://schemas.openxmlformats.org/drawingml/2006/main"/>
-            </wp:cNvGraphicFramePr>
-            <a:graphic xmlns:a="http://schemas.openxmlformats.org/drawingml/2006/main">
-              <a:graphicData uri="http://schemas.openxmlformats.org/drawingml/2006/picture">
-                <pic:pic xmlns:pic="http://schemas.openxmlformats.org/drawingml/2006/picture">
-                  <pic:nvPicPr>
-                    <pic:cNvPr id="0" name="Picture 13"/>
-                    <pic:cNvPicPr>
-                      <a:picLocks noChangeAspect="1" noChangeArrowheads="1"/>
-                    </pic:cNvPicPr>
-                  </pic:nvPicPr>
-                  <pic:blipFill>
-                    <a:blip r:embed="rId17" cstate="print">
-                      <a:extLst>
-                        <a:ext uri="{28A0092B-C50C-407E-A947-70E740481C1C}">
-                          <a14:useLocalDpi xmlns:a14="http://schemas.microsoft.com/office/drawing/2010/main" val="0"/>
-                        </a:ext>
-                      </a:extLst>
-                    </a:blip>
-                    <a:srcRect/>
-                    <a:stretch>
-                      <a:fillRect/>
-                    </a:stretch>
-                  </pic:blipFill>
-                  <pic:spPr bwMode="auto">
-                    <a:xfrm>
-                      <a:off x="0" y="0"/>
-                      <a:ext cx="5040000" cy="3240000"/>
-                    </a:xfrm>
-                    <a:prstGeom prst="rect">
-                      <a:avLst/>
-                    </a:prstGeom>
-                    <a:noFill/>
-                    <a:ln w="3175">
-                      <a:solidFill>
-                        <a:schemeClr val="tx1"/>
-                      </a:solidFill>
-                    </a:ln>
-                  </pic:spPr>
-                </pic:pic>
-              </a:graphicData>
-            </a:graphic>
-          </wp:inline>
-        </w:drawing>
-      </w:r>
-    </w:p>
-    <w:p>
       <w:r>
         <w:t>{{ img_photo_1 }}</w:t>
       </w:r>
@@ -4937,69 +4701,6 @@
           <w:sz w:val="20"/>
         </w:rPr>
         <w:t>{{ img_photo_1_caption }}</w:t>
-      </w:r>
-    </w:p>
-    <w:p>
-      <w:pPr>
-        <w:spacing w:after="0"/>
-        <w:jc w:val="center"/>
-        <w:rPr>
-          <w:rFonts w:ascii="Arial" w:hAnsi="Arial" w:cs="Arial"/>
-          <w:lang w:val="en-US"/>
-        </w:rPr>
-      </w:pPr>
-      <w:r>
-        <w:rPr>
-          <w:noProof/>
-        </w:rPr>
-        <w:drawing>
-          <wp:inline distT="0" distB="0" distL="0" distR="0" wp14:anchorId="07FDA1E8" wp14:editId="4772A145">
-            <wp:extent cx="5040000" cy="3240000"/>
-            <wp:effectExtent l="0" t="0" r="8255" b="0"/>
-            <wp:docPr id="594076759" name="Picture 10"/>
-            <wp:cNvGraphicFramePr>
-              <a:graphicFrameLocks xmlns:a="http://schemas.openxmlformats.org/drawingml/2006/main"/>
-            </wp:cNvGraphicFramePr>
-            <a:graphic xmlns:a="http://schemas.openxmlformats.org/drawingml/2006/main">
-              <a:graphicData uri="http://schemas.openxmlformats.org/drawingml/2006/picture">
-                <pic:pic xmlns:pic="http://schemas.openxmlformats.org/drawingml/2006/picture">
-                  <pic:nvPicPr>
-                    <pic:cNvPr id="0" name="Picture 15"/>
-                    <pic:cNvPicPr>
-                      <a:picLocks noChangeAspect="1" noChangeArrowheads="1"/>
-                    </pic:cNvPicPr>
-                  </pic:nvPicPr>
-                  <pic:blipFill>
-                    <a:blip r:embed="rId18" cstate="print">
-                      <a:extLst>
-                        <a:ext uri="{28A0092B-C50C-407E-A947-70E740481C1C}">
-                          <a14:useLocalDpi xmlns:a14="http://schemas.microsoft.com/office/drawing/2010/main" val="0"/>
-                        </a:ext>
-                      </a:extLst>
-                    </a:blip>
-                    <a:srcRect/>
-                    <a:stretch>
-                      <a:fillRect/>
-                    </a:stretch>
-                  </pic:blipFill>
-                  <pic:spPr bwMode="auto">
-                    <a:xfrm>
-                      <a:off x="0" y="0"/>
-                      <a:ext cx="5040000" cy="3240000"/>
-                    </a:xfrm>
-                    <a:prstGeom prst="rect">
-                      <a:avLst/>
-                    </a:prstGeom>
-                    <a:noFill/>
-                    <a:ln>
-                      <a:noFill/>
-                    </a:ln>
-                  </pic:spPr>
-                </pic:pic>
-              </a:graphicData>
-            </a:graphic>
-          </wp:inline>
-        </w:drawing>
       </w:r>
     </w:p>
     <w:p>

</xml_diff>